<commit_message>
docs: streamline README and manual, remove hashes and external URLs
</commit_message>
<xml_diff>
--- a/docs/Huong_Dan_Su_Dung_Vidora_v0.20.8.docx
+++ b/docs/Huong_Dan_Su_Dung_Vidora_v0.20.8.docx
@@ -1542,141 +1542,6 @@
           <w:szCs w:val="22"/>
         </w:rPr>
         <w:t xml:space="preserve">Dành cho Ubuntu, Debian, Linux Mint. Chạy lệnh: sudo apt install ./Vidora-Linux.deb để cài đặt vào hệ thống và tạo lối tắt trên màn hình ứng dụng.</w:t>
-      </w:r>
-    </w:p>
-    <w:p>
-      <w:pPr>
-        <w:pStyle w:val="Heading2"/>
-        <w:spacing w:after="140" w:before="280"/>
-      </w:pPr>
-      <w:r>
-        <w:rPr>
-          <w:rFonts w:ascii="Segoe UI" w:cs="Segoe UI" w:eastAsia="Segoe UI" w:hAnsi="Segoe UI"/>
-          <w:b/>
-          <w:bCs/>
-          <w:color w:val="4F46E5"/>
-          <w:sz w:val="26"/>
-          <w:szCs w:val="26"/>
-        </w:rPr>
-        <w:t xml:space="preserve">2.4. Xác minh Tính toàn vẹn File (SHA-256)</w:t>
-      </w:r>
-    </w:p>
-    <w:p>
-      <w:pPr>
-        <w:spacing w:after="120" w:before="60" w:line="276"/>
-      </w:pPr>
-      <w:r>
-        <w:rPr>
-          <w:rFonts w:ascii="Segoe UI" w:cs="Segoe UI" w:eastAsia="Segoe UI" w:hAnsi="Segoe UI"/>
-          <w:b w:val="false"/>
-          <w:bCs w:val="false"/>
-          <w:i w:val="false"/>
-          <w:iCs w:val="false"/>
-          <w:color w:val="1F2937"/>
-          <w:sz w:val="22"/>
-          <w:szCs w:val="22"/>
-        </w:rPr>
-        <w:t xml:space="preserve">Để đảm bảo tệp tải về không bị lỗi mạng hoặc can thiệp, bạn có thể kiểm tra mã băm SHA-256 đối chiếu với thông số công bố trên trang phát hành:</w:t>
-      </w:r>
-    </w:p>
-    <w:p>
-      <w:pPr>
-        <w:spacing w:after="80" w:before="40" w:line="270"/>
-      </w:pPr>
-      <w:r>
-        <w:rPr>
-          <w:rFonts w:ascii="Segoe UI" w:cs="Segoe UI" w:eastAsia="Segoe UI" w:hAnsi="Segoe UI"/>
-          <w:b/>
-          <w:bCs/>
-          <w:color w:val="1E1B4B"/>
-          <w:sz w:val="22"/>
-          <w:szCs w:val="22"/>
-        </w:rPr>
-        <w:t xml:space="preserve">• Vidora-Windows-Setup.exe: </w:t>
-      </w:r>
-      <w:r>
-        <w:rPr>
-          <w:rFonts w:ascii="Segoe UI" w:cs="Segoe UI" w:eastAsia="Segoe UI" w:hAnsi="Segoe UI"/>
-          <w:color w:val="1F2937"/>
-          <w:sz w:val="22"/>
-          <w:szCs w:val="22"/>
-        </w:rPr>
-        <w:t xml:space="preserve">1d8fa457cfd52b289984de166ff47910e7d1569c4b45646b7f18f19bb229d297</w:t>
-      </w:r>
-    </w:p>
-    <w:p>
-      <w:pPr>
-        <w:spacing w:after="80" w:before="40" w:line="270"/>
-      </w:pPr>
-      <w:r>
-        <w:rPr>
-          <w:rFonts w:ascii="Segoe UI" w:cs="Segoe UI" w:eastAsia="Segoe UI" w:hAnsi="Segoe UI"/>
-          <w:b/>
-          <w:bCs/>
-          <w:color w:val="1E1B4B"/>
-          <w:sz w:val="22"/>
-          <w:szCs w:val="22"/>
-        </w:rPr>
-        <w:t xml:space="preserve">• Vidora-Windows-Update.exe: </w:t>
-      </w:r>
-      <w:r>
-        <w:rPr>
-          <w:rFonts w:ascii="Segoe UI" w:cs="Segoe UI" w:eastAsia="Segoe UI" w:hAnsi="Segoe UI"/>
-          <w:color w:val="1F2937"/>
-          <w:sz w:val="22"/>
-          <w:szCs w:val="22"/>
-        </w:rPr>
-        <w:t xml:space="preserve">872c13f40e010d7c52a01cbc2e9d9edc14f4494f57b76b2a0a49eb220da19faa</w:t>
-      </w:r>
-    </w:p>
-    <w:p>
-      <w:pPr>
-        <w:spacing w:after="80" w:before="40" w:line="270"/>
-      </w:pPr>
-      <w:r>
-        <w:rPr>
-          <w:rFonts w:ascii="Segoe UI" w:cs="Segoe UI" w:eastAsia="Segoe UI" w:hAnsi="Segoe UI"/>
-          <w:b/>
-          <w:bCs/>
-          <w:color w:val="1E1B4B"/>
-          <w:sz w:val="22"/>
-          <w:szCs w:val="22"/>
-        </w:rPr>
-        <w:t xml:space="preserve">• Vidora-Linux.AppImage: </w:t>
-      </w:r>
-      <w:r>
-        <w:rPr>
-          <w:rFonts w:ascii="Segoe UI" w:cs="Segoe UI" w:eastAsia="Segoe UI" w:hAnsi="Segoe UI"/>
-          <w:color w:val="1F2937"/>
-          <w:sz w:val="22"/>
-          <w:szCs w:val="22"/>
-        </w:rPr>
-        <w:t xml:space="preserve">065f8c9c19046e9b644fe8b7819cb9cdc4d48c14f66bf52f61e5be9249c4dc87</w:t>
-      </w:r>
-    </w:p>
-    <w:p>
-      <w:pPr>
-        <w:spacing w:after="80" w:before="40" w:line="270"/>
-      </w:pPr>
-      <w:r>
-        <w:rPr>
-          <w:rFonts w:ascii="Segoe UI" w:cs="Segoe UI" w:eastAsia="Segoe UI" w:hAnsi="Segoe UI"/>
-          <w:b/>
-          <w:bCs/>
-          <w:color w:val="1E1B4B"/>
-          <w:sz w:val="22"/>
-          <w:szCs w:val="22"/>
-        </w:rPr>
-        <w:t xml:space="preserve">• Vidora-Linux.deb: </w:t>
-      </w:r>
-      <w:r>
-        <w:rPr>
-          <w:rFonts w:ascii="Segoe UI" w:cs="Segoe UI" w:eastAsia="Segoe UI" w:hAnsi="Segoe UI"/>
-          <w:color w:val="1F2937"/>
-          <w:sz w:val="22"/>
-          <w:szCs w:val="22"/>
-        </w:rPr>
-        <w:t xml:space="preserve">98201a13256215f21de5a635b3c595f52c3217eb26b0bf92ec0e1f46a7944634</w:t>
       </w:r>
     </w:p>
     <w:p>

</xml_diff>